<commit_message>
update Báo cáo lỗi
</commit_message>
<xml_diff>
--- a/BCL.docx
+++ b/BCL.docx
@@ -86,7 +86,10 @@
         <w:t>Giao cho:</w:t>
       </w:r>
       <w:r>
-        <w:t xml:space="preserve"> Nhóm phát triển Microsoft Excel</w:t>
+        <w:t xml:space="preserve"> </w:t>
+      </w:r>
+      <w:r>
+        <w:t>TTH</w:t>
       </w:r>
     </w:p>
     <w:p>
@@ -98,10 +101,7 @@
         <w:t>Người báo cáo:</w:t>
       </w:r>
       <w:r>
-        <w:t xml:space="preserve"> </w:t>
-      </w:r>
-      <w:r>
-        <w:t>Ngô Thảo Vy</w:t>
+        <w:t xml:space="preserve"> Ngô Thảo Vy</w:t>
       </w:r>
     </w:p>
     <w:p>
@@ -113,10 +113,7 @@
         <w:t>Ngày báo cáo:</w:t>
       </w:r>
       <w:r>
-        <w:t xml:space="preserve"> </w:t>
-      </w:r>
-      <w:r>
-        <w:t>30/12/2025</w:t>
+        <w:t xml:space="preserve"> 30/12/2025</w:t>
       </w:r>
     </w:p>
     <w:p>
@@ -149,20 +146,10 @@
           <w:b/>
           <w:bCs/>
         </w:rPr>
-        <w:t>Môi trường kiểm thử</w:t>
-      </w:r>
-      <w:r>
-        <w:rPr>
-          <w:b/>
-          <w:bCs/>
-        </w:rPr>
-        <w:t>:</w:t>
-      </w:r>
-      <w:r>
-        <w:t xml:space="preserve"> </w:t>
-      </w:r>
-      <w:r>
-        <w:t>Windows 11</w:t>
+        <w:t>Môi trường kiểm thử:</w:t>
+      </w:r>
+      <w:r>
+        <w:t xml:space="preserve"> Windows 11</w:t>
       </w:r>
     </w:p>
     <w:p>
@@ -1218,6 +1205,7 @@
   <w:style w:type="character" w:default="1" w:styleId="DefaultParagraphFont">
     <w:name w:val="Default Paragraph Font"/>
     <w:uiPriority w:val="1"/>
+    <w:semiHidden/>
     <w:unhideWhenUsed/>
   </w:style>
   <w:style w:type="table" w:default="1" w:styleId="TableNormal">

</xml_diff>